<commit_message>
Add/update resource data for AquiferOpenStudyNotes
</commit_message>
<xml_diff>
--- a/arb/docx/02.content.docx
+++ b/arb/docx/02.content.docx
@@ -178,13 +178,6 @@
         <w:rPr>
           <w:lang w:val="ar_AE" w:bidi="ar_AE"/>
         </w:rPr>
-      </w:r>
-      <w:r>
-        <w:rPr>
-          <w:i/>
-          <w:lang w:val="ar_AE" w:bidi="ar_AE"/>
-        </w:rPr>
-        <w:t>الخروج 1: 1, الخروج 1:1–22, خروج 1: 2–4, الخروج 1: 5, الخروج 1:6–7, الخروج 1: 8–10, الخروج 1: 10, الخروج 1: 11, الخروج 1: 12, خروج 1: 14, الخروج 1: 15, الخروج 1: 16, الخروج 1: 17, الخروج ١: ١٩, الخروج ١: ٢٠–٢١, خروج 2: 1, خروج ٢:١–٢٥, خروج ٢: ٢, الخروج ٢: ٣, خروج ٢: ٥–٦, الخروج ٢ :٧–٩, الخروج 2: 10, الخروج 2: 11–12, خروج ٢:١١–١٥, خروج 2: 13, خروج 2: 14, خروج 2: 15, الخروج 2: 16, الخروج 2: 16–25, خروج 2: 17, الخروج ٢: ١٨–٢٠, الخروج ٢: ٢٤–٢٥, خروج ٣: ١, الخروج 3: 1–10, خروج ٣: ١–٤: ٢٨, الخروج ٣:٢, خروج 3: 4, خروج 3: 5, الخروج 3: 6, الخروج ٣: ٧, الخروج 3: 8, الخروج 3: 10, خروج 3: 11–12, خروج 3: 11–4.17, خروج 3: 12, الخروج 3: 13–22, خروج 3: 14, الخروج 3: 15, الخروج 3: 16–17, الخروج 3: 18, خروج ٣: ١٩, الخروج ٣: ٢٠–٢١, خروج 4: 1–9, خروج ٤: ٣, خروج 4: 6, خروج ٤: ٩, خروج 4: 10–17, خروج 4: 11, خروج ٤: ١٣, الخروج ٤: ١٤–١٧, خروج 4: 18, خروج ٤: ٢٠, الخروج ٤: ٢١–٢٣, خروج 4:24–26, خروج 4: 25, خروج 4: 27, خروج ٤: ٢٩–٧: ٧, خروج 4: 31, خروج 5: 1, خروج ٥: ١–١٤, خروج ٥: ٢, خروج 5: 3, خروج ٥: ٤–٥, خروج 5: 6–14, خروج 5: 7, خروج 5: 22, خروج ٥: ٢٢–٢٣, خروج 6: 1, الخروج 6: 1–13, الخروج ٦: ٢–٣, الخروج ٦: ٢–٨, خروج 6: 7, خروج ٦: ٩, خروج 6: 10–13, خروج 6: 14–16, خروج ٦: ١٤–٣٠, خروج 6: 16–20, خروج 6: 18, خروج 6: 20–25, الخروج 7: 1–7, خروج 7: 3, خروج 7: 5, الخروج 7: 7, خروج 7: 8–11: 10, خروج ٧: ٨–١٢: ٣٠, الخروج 7: 9, خروج 7: 11, خروج 7: 14, خروج 7: 14–25, خروج 7: 22, الخروج ٨: ١–١٥, خروج ٨: ٧–٨, الخروج ٨: ٩, خروج 8: 10, خروج 8: 13, خروج 8: 16–19, خروج 8: 19, خروج 8: 20–32, خروج 8: 25, الخروج 8: 26–27, خروج ٨: ٢٩–٣٠, الخروج ٩: ١–٧, خروج 9: 3, الخروج 9: 5–6, الخروج ٩: ٨–١٢, خروج 9: 12, الخروج 9: 13–33, خروج ٩: ١٤–١٧, خروج 9: 16, الخروج 9: 20–21, الخروج 9: 26, خروج ٩: ٢٧, خروج 9: 29, الخروج 10: 1–20, الخروج 10: 2, خروج 10: 4, خروج 10: 7–11, خروج ١٠: ١٣, خروج ١٠: ١٣–١٥, خروج 10: 17, خروج 10: 21–29, خروج 10: 24, الخروج 10: 25–26, خروج 10: 27–29, خروج ١١: ١–٩, الخروج 11: 3, خروج ١١: ٥, الخروج 11: 7, خروج 11: 8, خروج 1:12–30, خروج 2:12, خروج 5:12, خروج 6:12, خروج 7:12, خروج 10:12, خروج 11:12, خروج 12:12, خروج 14:12, خروج 15:12, خروج 22:12, خروج 25:12, خروج 26:12–27, خروج ١٢: ٢٨–٣٠, خروج 12: 31–33, خروج 12: 31–14. 31, الخروج ١٢: ٣٥, الخروج 12: 37, الخروج 12: 38, خروج 12: 40, خروج ١٢: ٤٣–٥٠, خروج ١٢: ٤٦, خروج 12: 51, الخروج ١٣: ١–١٠, الخروج ١٣: ١–١٦, الخروج 13: 5, خروج 13: 9, خروج 13: 13, خروج 13: 16, خروج 13: 17–18, خروج ١٣: ١٧–١٤: 4, خروج 13: 18, خروج ١٣: ١٩, خروج 13: 20, خروج 13: 21, الخروج 14: 2, خروج 14: 4, خروج ١٤: ٥–١٤, خروج 14: 6–7, الخروج 14: 9, خروج 14: 10–12, الخروج 14: 13–14, خروج ١٤: ١٥–٣١, خروج 14: 17, خروج ١٤: ١٩–٢٥, الخروج 14: 22, خروج 14: 25, الخروج 14: 31, خروج 15: 1, خروج ١٥: ١–٥, الخروج 15: 1–18, خروج 15: 2, خروج 15: 3, خروج 15: 6, خروج 15: 6–12, الخروج 15: 8, خروج 15: 9–10, خروج 15: 11, الخروج 15: 13, خروج 15: 13–18, خروج 15: 14–15, خروج 15: 17, خروج ١٥: ١٩–٢١, خروج 15: 22–27, خروج 15: 22–18. 27, خروج 15: 23, خروج 15: 24, خروج 15: 25, خروج 15: 26, خروج ١٦: ١–٣٦, خروج 16: 2, خروج 16: 3, خروج ١٦: ٤–٥, خروج 16: 7, خروج 16: 15, الخروج ١٦: ١٩–٢٠, الخروج ١٦: ٢١–٣٠, الخروج ١٦: ٣٢–٣٦, خروج 16: 35, خروج 17: 1, خروج 17: 2, خروج 17: 3, خروج 17: 6, خروج 17: 8, خروج 17: 8–16, خروج ١٧: ٩, خروج 17: 9–13, خروج ١٧: ١٤–١٦, خروج 17: 15, خروج 17: 16, خروج ١٨: ١–١٢, خروج 18: 7, الخروج 18: 13–16, خروج 18: 13–27, خروج 18: 17–18, خروج 18: 19–22, خروج 19: 1, خروج ١٩: ١–٩, خروج 19: 2, الخروج 19: 3, الخروج 19: 5–6, الخروج 19: 7–8, خروج 19: 9, الخروج 19: 10–15, الخروج 19: 16–25, خروج ١٩: ٢١–٢٥, الخروج 20: 1, خروج 20: 1–17, خروج 20: 1–23. 33, خروج 20: 2, الخروج 20: 3, خروج 20: 3–11, خروج 20: 3–17, خروج 20: 4, الخروج ٢٠: ٥–٦, خروج 20: 7, خروج 20: 8–11, خروج ٢٠: ١١, خروج 20: 12, خروج 20: 12–17, خروج 20: 13, الخروج 20: 14, خروج 20: 15, الخروج 20: 16, الخروج 20: 17, خروج 20: 18–21, خروج ٢٠: ١٨–٢٦, الخروج ٢٠: ٢٢–٢٦, الخروج 21: 1–11, الخروج 21: 1–23: 19, خروج 21: 1–23: 33, الخروج ٢١: ٢, خروج 21: 3, خروج 21: 4–6, خروج 21: 7–9, الخروج 21: 12–17, الخروج 21: 14, خروج 21: 17, الخروج 21: 18–27, خروج 21: 22–25, الخروج 21: 28–32, الخروج 21: 33–22: 15, خروج 22: 16–31, الخروج 22: 18, خروج 22: 20, خروج 22: 21, الخروج 22: 22–23, خروج ٢٢: ٢٥–٢٧, خروج 22: 30, خروج 22: 31, الخروج 23: 1–3, خروج 23: 1–9, الخروج 23: 7, خروج 23: 10–12, خروج 23: 14–17, خروج 23: 15, خروج 23: 16, خروج 23: 18, خروج 23: 19, خروج 23: 20–23, خروج 23: 20–33, خروج 23: 24, خروج 23: 26, خروج ٢٣: ٢٩–٣١, خروج 23: 31, الخروج ٢٣: ٣٣, خروج 24: 1–2, خروج 24: 1–18, خروج 24: 3, خروج 24: 4, خروج 24: 6, خروج 24: 7, خروج 24: 8, خروج 24: 10, خروج 24: 11, خروج 24: 12, خروج 24: 17, خروج 25: 1–27: 19, خروج 25: 1–40: 38, خروج 25: 2, خروج 25: 8, خروج 25: 9, الخروج 25: 10–22, خروج 25: 12–15, خروج 25: 17, خروج 25: 18, خروج ٢٥: ٢٢, خروج 25: 23–30, خروج 25: 29, الخروج 25: 31–39, خروج ٢٦: ١–٣٧, خروج ٢٦: ٢–٦, خروج 26: 9, خروج 26: 15, خروج 26: 19, خروج 26: 31, خروج 26: 33, خروج ٢٦: ٣٦–٣٧, الخروج 27: 1–8, الخروج 27: 1–19, خروج 27: 2, خروج 27: 5, خروج ٢٧: ٩–١٩, خروج 27: 16, خروج 27: 19, الخروج 27: 20–21, الخروج 27: 20–30. 38, خروج ٢٧: ٢١, خروج 28: 1–2, خروج 28: 1–43, خروج 28: 6–14, الخروج 28: 12, خروج 28: 15–30, خروج 28: 29, خروج 28: 30, خروج ٢٨: ٣١–٣٥, خروج ٢٨: ٣٦–٣٨, خروج 28: 39, خروج ٢٨: ٤٢–٤٣, خروج 29: 1, خروج ٢٩: ١–٣٧, خروج 29: 4, خروج 29: 7, خروج 29: 9, خروج 29: 10–34, خروج 29: 13, خروج 29: 14, خروج 29: 15–18, خروج 29: 18, خروج 29: 19–28, خروج 29: 20–21, خروج 29: 30, خروج 29: 31, خروج 29: 32–34, خروج 29: 33, خروج ٢٩: ٣٧, خروج ٢٩: ٣٨–٤١, خروج 29: 42–46, خروج 29: 46, الخروج 30: 1–10, خروج 30: 6, خروج 30: 12, خروج 30: 17–21, خروج ٣٠: ٢٢–٣٨, الخروج 30: 33, خروج 31: 1–11, خروج 31: 3, خروج 31: 6, خروج 31: 11, خروج 31: 12–18, خروج 31: 14–15, خروج 31: 18, خروج ٣٢: ١, خروج 32: 1–6, خروج ٣٢: ١–٣٥, خروج ٣٢: ٢–٤, خروج ٣٢: ٤, خروج ٣٢: ٥, خروج ٣٢: ٦, خروج ٣٢: ٧, خروج ٣٢: ٩–١٠, خروج 32: 10, خروج ٣٢: ١١–١٣, خروج ٣٢: ١٤, خروج ٣٢: ١٥–٢٩, الخروج 32: 16, خروج ٣٢: ١٩, خروج ٣٢: ٢٠, خروج ٣٢: ٢١–٢٥, خروج 32: 25, خروج 32: 26–29, خروج ٣٢: ٣٠–٣٥, خروج ٣٢: ٣٢, الخروج 32: 33, خروج ٣٢: ٣٤, الخروج ٣٣: ١–٦, خروج ٣٣: ٢–٣, خروج ٣٣: ٣, خروج ٣٣: ٤–٦, الخروج ٣٣: ٧, خروج ٣٣: ٧–١١, خروج ٣٣: ٨–١١, خروج ٣٣: ١١, خروج 33: 12, خروج 33: 12–23, خروج ٣٣: ١٣, خروج 33: 14, خروج ٣٣: ١٥–١٦, خروج 33: 17, خروج 33: 18, خروج 33: 19, خروج ٣٣: ٢٠–٢٣, خروج ٣٤: ١–٣, خروج 34: 1–35, خروج ٣٤: ٥–٦, خروج ٣٤: ٥–٩, خروج ٣٤: ٦, خروج ٣٤: ٧, خروج 34: 8–9, خروج 34: 10–11, خروج 34: 10–26, خروج ٣٤: ١٢–١٧, خروج 34: 13, خروج 34: 16, الخروج 34: 22, خروج 34: 23, خروج ٣٤ :٢٤, خروج 34: 27–28, خروج ٣٤: ٢٩–٣٥, خروج 34: 33, خروج 35: 1–40. 38, الخروج 35: 4–36. 7, خروج ٣٧: ١–٢٩, خروج 38: 1–20, خروج 38:8, خروج ٣٨: ٢١, خروج 38: 21–29, خروج 38: 26, خروج ٣٩: ١–٣١, خروج 39: 30, خروج ٣٩: ٣٢–٤٣, الخروج 40: 1–33, الخروج 40: 2, خروج 40: 3, خروج 40: 33, خروج ٤٠: ٣٤–٣٨, خروج 40: 38</w:t>
       </w:r>
       <w:r>
         <w:rPr>

</xml_diff>

<commit_message>
Update AquiferOpenStudyNotes for 2026-07-14
</commit_message>
<xml_diff>
--- a/arb/docx/02.content.docx
+++ b/arb/docx/02.content.docx
@@ -22,7 +22,7 @@
         <w:rPr>
           <w:lang w:val="ar_AE" w:bidi="ar_AE"/>
         </w:rPr>
-        <w:t>Resource: Tyndale Open Study Notes</w:t>
+        <w:t>Resource: Aquifer Open Study Notes</w:t>
       </w:r>
       <w:r>
         <w:rPr>
@@ -122,7 +122,7 @@
         <w:rPr>
           <w:lang w:val="ar_AE" w:bidi="ar_AE"/>
         </w:rPr>
-        <w:t>Tyndale Open Study Notes</w:t>
+        <w:t>Aquifer Open Study Notes</w:t>
       </w:r>
     </w:p>
     <w:p>

</xml_diff>